<commit_message>
Update table assignments and logo
</commit_message>
<xml_diff>
--- a/stolovipopis/Stol 1.docx
+++ b/stolovipopis/Stol 1.docx
@@ -196,7 +196,7 @@
           <w:szCs w:val="32"/>
           <w:lang w:val="hr-BA"/>
         </w:rPr>
-        <w:t xml:space="preserve">Jurić Tomo </w:t>
+        <w:t xml:space="preserve">Ćebić Marko </w:t>
       </w:r>
     </w:p>
     <w:p>
@@ -218,7 +218,7 @@
           <w:szCs w:val="32"/>
           <w:lang w:val="hr-BA"/>
         </w:rPr>
-        <w:t>Jurić Martina</w:t>
+        <w:t>Jurić Lucija</w:t>
       </w:r>
     </w:p>
     <w:p>

</xml_diff>

<commit_message>
Ukloni Ženet sa stola 1
</commit_message>
<xml_diff>
--- a/stolovipopis/Stol 1.docx
+++ b/stolovipopis/Stol 1.docx
@@ -1,6 +1,6 @@
 
 <file path=word/document.xml><?xml version="1.0" encoding="utf-8"?>
-<w:document xmlns:wpc="http://schemas.microsoft.com/office/word/2010/wordprocessingCanvas" xmlns:cx="http://schemas.microsoft.com/office/drawing/2014/chartex" xmlns:cx1="http://schemas.microsoft.com/office/drawing/2015/9/8/chartex" xmlns:cx2="http://schemas.microsoft.com/office/drawing/2015/10/21/chartex" xmlns:cx3="http://schemas.microsoft.com/office/drawing/2016/5/9/chartex" xmlns:cx4="http://schemas.microsoft.com/office/drawing/2016/5/10/chartex" xmlns:cx5="http://schemas.microsoft.com/office/drawing/2016/5/11/chartex" xmlns:cx6="http://schemas.microsoft.com/office/drawing/2016/5/12/chartex" xmlns:cx7="http://schemas.microsoft.com/office/drawing/2016/5/13/chartex" xmlns:cx8="http://schemas.microsoft.com/office/drawing/2016/5/14/chartex" xmlns:mc="http://schemas.openxmlformats.org/markup-compatibility/2006" xmlns:aink="http://schemas.microsoft.com/office/drawing/2016/ink" xmlns:am3d="http://schemas.microsoft.com/office/drawing/2017/model3d" xmlns:o="urn:schemas-microsoft-com:office:office" xmlns:oel="http://schemas.microsoft.com/office/2019/extlst" xmlns:r="http://schemas.openxmlformats.org/officeDocument/2006/relationships" xmlns:m="http://schemas.openxmlformats.org/officeDocument/2006/math" xmlns:v="urn:schemas-microsoft-com:vml" xmlns:wp14="http://schemas.microsoft.com/office/word/2010/wordprocessingDrawing" xmlns:wp="http://schemas.openxmlformats.org/drawingml/2006/wordprocessingDrawing" xmlns:w10="urn:schemas-microsoft-com:office:word" xmlns:w="http://schemas.openxmlformats.org/wordprocessingml/2006/main" xmlns:w14="http://schemas.microsoft.com/office/word/2010/wordml" xmlns:w15="http://schemas.microsoft.com/office/word/2012/wordml" xmlns:w16cex="http://schemas.microsoft.com/office/word/2018/wordml/cex" xmlns:w16cid="http://schemas.microsoft.com/office/word/2016/wordml/cid" xmlns:w16="http://schemas.microsoft.com/office/word/2018/wordml" xmlns:w16du="http://schemas.microsoft.com/office/word/2023/wordml/word16du" xmlns:w16sdtdh="http://schemas.microsoft.com/office/word/2020/wordml/sdtdatahash" xmlns:w16sdtfl="http://schemas.microsoft.com/office/word/2024/wordml/sdtformatlock" xmlns:w16se="http://schemas.microsoft.com/office/word/2015/wordml/symex" xmlns:wpg="http://schemas.microsoft.com/office/word/2010/wordprocessingGroup" xmlns:wpi="http://schemas.microsoft.com/office/word/2010/wordprocessingInk" xmlns:wne="http://schemas.microsoft.com/office/word/2006/wordml" xmlns:wps="http://schemas.microsoft.com/office/word/2010/wordprocessingShape" mc:Ignorable="w14 w15 w16se w16cid w16 w16cex w16sdtdh w16sdtfl w16du wp14">
+<w:document xmlns:mc="http://schemas.openxmlformats.org/markup-compatibility/2006" xmlns:w="http://schemas.openxmlformats.org/wordprocessingml/2006/main" xmlns:w14="http://schemas.microsoft.com/office/word/2010/wordml" mc:Ignorable="w14 w15 w16se w16cid w16 w16cex w16sdtdh w16sdtfl w16du wp14">
   <w:body>
     <w:p>
       <w:pPr>
@@ -92,28 +92,6 @@
           <w:lang w:val="hr-BA"/>
         </w:rPr>
         <w:t>Jurić Frano</w:t>
-      </w:r>
-    </w:p>
-    <w:p>
-      <w:pPr>
-        <w:pStyle w:val="Listenabsatz"/>
-        <w:numPr>
-          <w:ilvl w:val="0"/>
-          <w:numId w:val="1"/>
-        </w:numPr>
-        <w:rPr>
-          <w:sz w:val="32"/>
-          <w:szCs w:val="32"/>
-          <w:lang w:val="hr-BA"/>
-        </w:rPr>
-      </w:pPr>
-      <w:r>
-        <w:rPr>
-          <w:sz w:val="32"/>
-          <w:szCs w:val="32"/>
-          <w:lang w:val="hr-BA"/>
-        </w:rPr>
-        <w:t>Jurić Ženet</w:t>
       </w:r>
     </w:p>
     <w:p>

</xml_diff>